<commit_message>
Sync persona routing names (Execs/CIO/CAIO/CISO, AI Builders) in README + runbook docx
Co-Authored-By: Claude Opus 4.8 <noreply@anthropic.com>
Claude-Session: https://claude.ai/code/session_015ZWvrFYVoFJWbwDM3Jvb31
</commit_message>
<xml_diff>
--- a/docs/AI4_VisionOne_Challenge_BoothRunbook.docx
+++ b/docs/AI4_VisionOne_Challenge_BoothRunbook.docx
@@ -88,7 +88,7 @@
           <w:b/>
           <w:bCs/>
         </w:rPr>
-        <w:t xml:space="preserve">Executives / CISOs / CIOs (budget-holders): </w:t>
+        <w:t xml:space="preserve">Execs / CIO / CAIO / CISO (budget-holders): </w:t>
       </w:r>
       <w:r>
         <w:rPr>
@@ -112,7 +112,7 @@
           <w:b/>
           <w:bCs/>
         </w:rPr>
-        <w:t xml:space="preserve">Builders / ML &amp; app engineers: </w:t>
+        <w:t xml:space="preserve">AI Builders: </w:t>
       </w:r>
       <w:r>
         <w:rPr>

</xml_diff>

<commit_message>
Rename 'pillar' -> 'layer' (Visibility/Control/Governance are layers)
Across code (LAYERS, LAYER_BY_ID, layer field, _layers_covered), frontend,
tests, README, docs, the runbook .docx, and the PDF + screen-deck generators
(regenerated dist/ + docs/ assets). 18 tests pass.

Co-Authored-By: Claude Opus 4.8 <noreply@anthropic.com>
Claude-Session: https://claude.ai/code/session_015ZWvrFYVoFJWbwDM3Jvb31
</commit_message>
<xml_diff>
--- a/docs/AI4_VisionOne_Challenge_BoothRunbook.docx
+++ b/docs/AI4_VisionOne_Challenge_BoothRunbook.docx
@@ -60,7 +60,7 @@
         <w:rPr>
           <w:rFonts w:ascii="Arial" w:cs="Arial" w:eastAsia="Arial" w:hAnsi="Arial"/>
         </w:rPr>
-        <w:t xml:space="preserve">Attendees pick up a Challenge Passport and clear stations with a TrendAI guide — about five minutes each. The eight challenges are organized along the Visibility → Control → Governance spine. Beating one challenge in each pillar fills the passport and enters the grand-prize draw; extra stations and Boss Level score bonus points. Stamps feed the live leaderboard on the booth screen. Everything runs in a synthetic demo tenant — no real customer or personal data, ever.</w:t>
+        <w:t xml:space="preserve">Attendees pick up a Challenge Passport and clear stations with a TrendAI guide — about five minutes each. The eight challenges are organized along the Visibility → Control → Governance spine. Beating one challenge in each layer fills the passport and enters the grand-prize draw; extra stations and Boss Level score bonus points. Stamps feed the live leaderboard on the booth screen. Everything runs in a synthetic demo tenant — no real customer or personal data, ever.</w:t>
       </w:r>
     </w:p>
     <w:p>
@@ -5078,7 +5078,7 @@
         <w:rPr>
           <w:rFonts w:ascii="Arial" w:cs="Arial" w:eastAsia="Arial" w:hAnsi="Arial"/>
         </w:rPr>
-        <w:t xml:space="preserve">Full passport = one challenge cleared in each pillar (Visibility, Control, Governance) → premium swag + grand-prize draw entry. Extra stations and Boss Level score bonus points.</w:t>
+        <w:t xml:space="preserve">Full passport = one challenge cleared in each layer (Visibility, Control, Governance) → premium swag + grand-prize draw entry. Extra stations and Boss Level score bonus points.</w:t>
       </w:r>
     </w:p>
     <w:p>

</xml_diff>